<commit_message>
Ritcha booklet v3: one-line running header, Tehila/RimonMF/Gisha/TNR fonts, markers centred between their squares, מז notes block removed
Co-Authored-By: Claude <noreply@anthropic.com>
Claude-Session: https://claude.ai/code/session_01Q1jkjwjQaKa3rYDjzuy56g
</commit_message>
<xml_diff>
--- a/ritcha/דוח_שילוב_וכפילויות.docx
+++ b/ritcha/דוח_שילוב_וכפילויות.docx
@@ -127,7 +127,7 @@
           <w:sz w:val="28"/>
           <w:rtl/>
         </w:rPr>
-        <w:t>תיקוני העיצוב שבוצעו</w:t>
+        <w:t>עיצוב – מה שונה בגרסה זו</w:t>
       </w:r>
     </w:p>
     <w:p>
@@ -143,7 +143,7 @@
           <w:sz w:val="22"/>
           <w:rtl/>
         </w:rPr>
-        <w:t>• כותרות משנה נמחקו (נשארו רק כותרות הסימנים והכותרות הראשיות של החלקים).</w:t>
+        <w:t>• כותרת העמוד היא שורה אחת: "סימן X" משמאל, העיטור כמפריד באמצע, ו"ריתחא דאורייתא" מימין. הכותרת קטנה יותר מקודם וציון הסימן גדול יותר.</w:t>
       </w:r>
     </w:p>
     <w:p>
@@ -159,7 +159,7 @@
           <w:sz w:val="22"/>
           <w:rtl/>
         </w:rPr>
-        <w:t>• בחלק "הלכה למעשה" הוסר הנוסח "הלכה למעשה:" מתחילת כל שאלה; מהכותרת הוסר " – בין הזמנים".</w:t>
+        <w:t>• הגופנים: טקסט רץ – Tehila (16); כותרת סימן ואותיות המספור – RimonMF; שמות השואלים והמקורות – Gisha; מספור עמודים – Times New Roman.</w:t>
       </w:r>
     </w:p>
     <w:p>
@@ -175,7 +175,7 @@
           <w:sz w:val="22"/>
           <w:rtl/>
         </w:rPr>
-        <w:t>• החלק "הלכה למעשה" מתחיל בעמוד חדש; עיטור הסיום הועבר לעמוד שלפניו (ואין עיטור בסוף החוברת).</w:t>
+        <w:t>• כל אות לפני שאלה ממורכזת בדיוק בין שני הריבועים שמצדדיה – גם אנכית וגם אופקית (המיקום חושב לפי צורת האות בגופן, לכל אות בנפרד).</w:t>
       </w:r>
     </w:p>
     <w:p>
@@ -191,7 +191,7 @@
           <w:sz w:val="22"/>
           <w:rtl/>
         </w:rPr>
-        <w:t>• הכותרת "שאלות לעיונא" הוסרה.</w:t>
+        <w:t>• בלוק הציטוטים והמקורות שבסימן מז (בקובץ "זאדה ריתחא – מז") הוסר לגמרי.</w:t>
       </w:r>
     </w:p>
     <w:p>
@@ -207,39 +207,7 @@
           <w:sz w:val="22"/>
           <w:rtl/>
         </w:rPr>
-        <w:t>• הלוגו ו"ברצות ה'" הוסרו מהעמוד הראשון.</w:t>
-      </w:r>
-    </w:p>
-    <w:p>
-      <w:pPr>
-        <w:spacing w:before="0" w:after="80"/>
-        <w:ind w:right="340"/>
-        <w:bidi/>
-        <w:jc w:val="right"/>
-      </w:pPr>
-      <w:r>
-        <w:rPr>
-          <w:b w:val="0"/>
-          <w:sz w:val="22"/>
-          <w:rtl/>
-        </w:rPr>
-        <w:t>• הכותרת "ריתחא דאורייתא" (עם העיטורים) היא כותרת עמוד וחוזרת בראש כל עמוד.</w:t>
-      </w:r>
-    </w:p>
-    <w:p>
-      <w:pPr>
-        <w:spacing w:before="0" w:after="80"/>
-        <w:ind w:right="340"/>
-        <w:bidi/>
-        <w:jc w:val="right"/>
-      </w:pPr>
-      <w:r>
-        <w:rPr>
-          <w:b w:val="0"/>
-          <w:sz w:val="22"/>
-          <w:rtl/>
-        </w:rPr>
-        <w:t>• רעיון עיצובי לסימן: מתחת לכותרת העמוד מופיעה שורה "■ סימן X ■" (באותו סגנון של האותיות א, ב, ג). היא מתעדכנת אוטומטית בוורד לפי כותרת הסימן שבעמוד (שדה STYLEREF). בעמוד שנפתח באמצע סימן מוצג הסימן הקודם; בעמוד שמתחיל בו סימן חדש מוצג החדש.</w:t>
+        <w:t>• נשארו בתוקף: אין כותרות משנה, אין לוגו ו"ברצות ה'", הפתיחה של "שאלה להלכה למעשה" בעמוד חדש כשעיטור הסיום בעמוד שלפניה, והסרת הנוסח "הלכה למעשה:" מתחילת השאלות.</w:t>
       </w:r>
     </w:p>
     <w:p>
@@ -3064,7 +3032,7 @@
           <w:sz w:val="22"/>
           <w:rtl/>
         </w:rPr>
-        <w:t>• שורה "שאלה לענות אמן באמצע ק"ש" (אהרן לייב פריזנד) מופיעה בקובץ של סימן ח, אבל מצוין בה "סי' סו סעיף ג" – שיבצתי אותה בסימן סו.</w:t>
+        <w:t>• הטקסט שב-RimonMF (כותרות הסימנים, אותיות המספור וציון הסימן בראש העמוד) שמור בקידוד של הגופן – כמו Wingdings – כדי שיוצג בדיוק כמו ב-PDF. להוספת סימן חדש הכי נוח להעתיק כותרת סימן קיימת ולשנות אותה; אם בוורד שלך הקלדה עברית ישירה בגופן הזה עובדת – אפשר גם כך.</w:t>
       </w:r>
     </w:p>
     <w:p>
@@ -3080,7 +3048,7 @@
           <w:sz w:val="22"/>
           <w:rtl/>
         </w:rPr>
-        <w:t>• בקובץ "זאדה ריתחא – מז" יש אחרי השאלה על קטן בר מצוה בלוק של ציטוטים והערות (בלי סימני שאלה, חלקם חלקיים כמו "שו"ת מתת ידו סי'"). הכנסתי אותו כשורות מקורות קטנות מתחת לשאלה – כדאי לעבור עליו.</w:t>
+        <w:t>• שורה "שאלה לענות אמן באמצע ק"ש" (אהרן לייב פריזנד) מופיעה בקובץ של סימן ח, אבל מצוין בה "סי' סו סעיף ג" – שיבצתי אותה בסימן סו.</w:t>
       </w:r>
     </w:p>
     <w:p>

</xml_diff>